<commit_message>
feat: add verification scripts, audit outputs, and updated research documents for systematic literature review
</commit_message>
<xml_diff>
--- a/project/resultados/Articulo_RSL_Resultados_Completo_IEEE.docx
+++ b/project/resultados/Articulo_RSL_Resultados_Completo_IEEE.docx
@@ -1846,7 +1846,7 @@
                 <w:rFonts w:ascii="Times New Roman" w:hAnsi="Times New Roman"/>
                 <w:sz w:val="16"/>
               </w:rPr>
-              <w:t>[9], [33], [35], [39], [50], [65], [66], [70], [77], [115]</w:t>
+              <w:t>[9], [33], [35], [39], [50], [65], [66], [77], [115]</w:t>
             </w:r>
           </w:p>
         </w:tc>
@@ -1871,7 +1871,7 @@
                 <w:rFonts w:ascii="Times New Roman" w:hAnsi="Times New Roman"/>
                 <w:sz w:val="16"/>
               </w:rPr>
-              <w:t>10 (7.6 %)</w:t>
+              <w:t>9 (6.9 %)</w:t>
             </w:r>
           </w:p>
         </w:tc>
@@ -3201,7 +3201,7 @@
                 <w:rFonts w:ascii="Times New Roman" w:hAnsi="Times New Roman"/>
                 <w:sz w:val="16"/>
               </w:rPr>
-              <w:t>Otras 61 revistas indexadas (&lt;= 2 estudios c/u)</w:t>
+              <w:t>Otras 62 revistas indexadas (&lt;= 2 estudios c/u)</w:t>
             </w:r>
           </w:p>
         </w:tc>
@@ -3301,7 +3301,7 @@
                 <w:rFonts w:ascii="Times New Roman" w:hAnsi="Times New Roman"/>
                 <w:sz w:val="16"/>
               </w:rPr>
-              <w:t>70 (53.4 %)</w:t>
+              <w:t>71 (54.2 %)</w:t>
             </w:r>
           </w:p>
         </w:tc>
@@ -4761,7 +4761,7 @@
         </w:rPr>
         <w:t>La evidencia se estructura en tres dimensiones bibliométricas:</w:t>
         <w:br/>
-        <w:t>a) Núcleos de difusión y revistas líderes: Doce revistas concentraron el 46.6 % de la producción global (61 de 131 artículos; TABLA XIV). El canal predominante fue IEEE Access con 13 artículos (9.9 %; [5], [8], [16], [26], [59]–[61], [84], [88], [94], [103], [108], [131]), seguido de International Journal on Document Analysis and Recognition (IJDAR) de Springer con 10 artículos (7.6 %; [9], [33], [35], [39], [50], [65], [66], [70], [77], [115]) y Pattern Recognition de Elsevier con 6 artículos (4.6 %; [3], [41], [80], [92], [105], [120]).</w:t>
+        <w:t>a) Núcleos de difusión y revistas líderes: Doce revistas concentraron el 45.8 % de la producción global (60 de 131 artículos; TABLA XIV). El canal predominante fue IEEE Access con 13 artículos (9.9 %; [5], [8], [16], [26], [59]–[61], [84], [88], [94], [103], [108], [131]), seguido de International Journal on Document Analysis and Recognition (IJDAR) de Springer con 9 artículos (6.9 %; [9], [33], [35], [39], [50], [65], [66], [77], [115]) y Pattern Recognition de Elsevier con 6 artículos (4.6 %; [3], [41], [80], [92], [105], [120]).</w:t>
         <w:br/>
         <w:t>b) Polos geográficos de investigación: Conforme a la regla de asignación por primer autor, China lideró con 39 estudios (29.8 %; TABLA XV, Fig. 3a), seguida de India con 11 estudios (8.4 %) y Estados Unidos con 10 estudios (7.6 %). Europa occidental sumó presencia relevante con Alemania (9 estudios, 6.9 %) y España (3 estudios, 2.3 %).</w:t>
         <w:br/>

</xml_diff>